<commit_message>
docs(insa): fill test-account credentials in audit package
Dagi provided working phone/password credentials for one test account
per app: Customer/Ride (shared identity), Driver, Courier,
ServiceGiver, and Admin (elevated). Filled into Section 4's test
account table and Section 8.5's API testing placeholder.

The original table had a single combined "Driver/Courier App" row,
but Driver and Courier are separate accounts/apps in the live system
and Dagi provided distinct credentials for each - split that row into
two (Driver App / Courier App) with their own URL and account.

Verified with the docx skill's XSD validator (all validations passed;
paragraph count went 1048 -> 1051, expected from the row split).

Still open: the optional internal-audit-report attachment and the
contact email in Section 9.

Co-Authored-By: Claude Sonnet 5 <noreply@anthropic.com>
Claude-Session: https://claude.ai/code/session_0128uJ4AqFvT2QYuN1cWX6W6
</commit_message>
<xml_diff>
--- a/docs/INSA_Audit_Package_Etel_Delivery_Ride.docx
+++ b/docs/INSA_Audit_Package_Etel_Delivery_Ride.docx
@@ -1081,7 +1081,7 @@
           </w:tcPr>
           <w:p>
             <w:r>
-              <w:t xml:space="preserve">[TO COMPLETE: create dedicated test account]</w:t>
+              <w:t xml:space="preserve">Phone 0945485932 / Password Meri1616.</w:t>
             </w:r>
           </w:p>
         </w:tc>
@@ -1113,7 +1113,7 @@
           </w:tcPr>
           <w:p>
             <w:r>
-              <w:t xml:space="preserve">[TO COMPLETE]</w:t>
+              <w:t xml:space="preserve">Phone 0945485932 / Password Meri1616. (same account as Customer App - both apps share one customer identity)</w:t>
             </w:r>
           </w:p>
         </w:tc>
@@ -1125,7 +1125,7 @@
           </w:tcPr>
           <w:p>
             <w:r>
-              <w:t xml:space="preserve">Driver/Courier App</w:t>
+              <w:t xml:space="preserve">Driver App</w:t>
             </w:r>
           </w:p>
         </w:tc>
@@ -1145,7 +1145,7 @@
           </w:tcPr>
           <w:p>
             <w:r>
-              <w:t xml:space="preserve">[TO COMPLETE]</w:t>
+              <w:t xml:space="preserve">Phone 0938847379 / Password Bini7379</w:t>
             </w:r>
           </w:p>
         </w:tc>
@@ -1157,6 +1157,38 @@
           </w:tcPr>
           <w:p>
             <w:r>
+              <w:t xml:space="preserve">Courier App</w:t>
+            </w:r>
+          </w:p>
+        </w:tc>
+        <w:tc>
+          <w:tcPr>
+            <w:tcW w:type="dxa" w:w="4800"/>
+          </w:tcPr>
+          <w:p>
+            <w:r>
+              <w:t xml:space="preserve">ethelmarket.com/delivery/courier/index.html</w:t>
+            </w:r>
+          </w:p>
+        </w:tc>
+        <w:tc>
+          <w:tcPr>
+            <w:tcW w:type="dxa" w:w="3000"/>
+          </w:tcPr>
+          <w:p>
+            <w:r>
+              <w:t xml:space="preserve">Phone 0936533606 / Password Emu1616.</w:t>
+            </w:r>
+          </w:p>
+        </w:tc>
+      </w:tr>
+      <w:tr>
+        <w:tc>
+          <w:tcPr>
+            <w:tcW w:type="dxa" w:w="2200"/>
+          </w:tcPr>
+          <w:p>
+            <w:r>
               <w:t xml:space="preserve">ServiceGiver App</w:t>
             </w:r>
           </w:p>
@@ -1177,7 +1209,7 @@
           </w:tcPr>
           <w:p>
             <w:r>
-              <w:t xml:space="preserve">[TO COMPLETE]</w:t>
+              <w:t xml:space="preserve">Phone 0912461100 / Password Tamu1616.</w:t>
             </w:r>
           </w:p>
         </w:tc>
@@ -1209,7 +1241,7 @@
           </w:tcPr>
           <w:p>
             <w:r>
-              <w:t xml:space="preserve">[TO COMPLETE — separate elevated-privilege account]</w:t>
+              <w:t xml:space="preserve">Phone 0924445206 / Password EtelAnan1616.</w:t>
             </w:r>
           </w:p>
         </w:tc>
@@ -12038,12 +12070,7 @@
         <w:spacing w:after="120"/>
       </w:pPr>
       <w:r>
-        <w:rPr>
-          <w:i/>
-          <w:iCs/>
-          <w:color w:val="AA0000"/>
-        </w:rPr>
-        <w:t xml:space="preserve">[TO COMPLETE: provide one dedicated test account per privilege level (admin, driver, customer, service giver) with credentials that work against the live API, per INSA requirement 5.4.9]</w:t>
+        <w:t xml:space="preserve">Reuses the same accounts listed in Section 4 (Customer/Ride, Driver, Courier, ServiceGiver, Admin). Obtain a bearer token via POST api/boot.php with action=login and the phone/password above, then call any action as Authorization: Bearer &lt;token&gt;.</w:t>
       </w:r>
     </w:p>
     <w:p>

</xml_diff>